<commit_message>
ansible - facts updated
</commit_message>
<xml_diff>
--- a/Ansible/8-facts.docx
+++ b/Ansible/8-facts.docx
@@ -1,6 +1,6 @@
 
 <file path=word/document.xml><?xml version="1.0" encoding="utf-8"?>
-<w:document xmlns:wpc="http://schemas.microsoft.com/office/word/2010/wordprocessingCanvas" xmlns:cx="http://schemas.microsoft.com/office/drawing/2014/chartex" xmlns:cx1="http://schemas.microsoft.com/office/drawing/2015/9/8/chartex" xmlns:cx2="http://schemas.microsoft.com/office/drawing/2015/10/21/chartex" xmlns:cx3="http://schemas.microsoft.com/office/drawing/2016/5/9/chartex" xmlns:cx4="http://schemas.microsoft.com/office/drawing/2016/5/10/chartex" xmlns:cx5="http://schemas.microsoft.com/office/drawing/2016/5/11/chartex" xmlns:cx6="http://schemas.microsoft.com/office/drawing/2016/5/12/chartex" xmlns:cx7="http://schemas.microsoft.com/office/drawing/2016/5/13/chartex" xmlns:cx8="http://schemas.microsoft.com/office/drawing/2016/5/14/chartex" xmlns:mc="http://schemas.openxmlformats.org/markup-compatibility/2006" xmlns:aink="http://schemas.microsoft.com/office/drawing/2016/ink" xmlns:am3d="http://schemas.microsoft.com/office/drawing/2017/model3d" xmlns:o="urn:schemas-microsoft-com:office:office" xmlns:oel="http://schemas.microsoft.com/office/2019/extlst" xmlns:r="http://schemas.openxmlformats.org/officeDocument/2006/relationships" xmlns:m="http://schemas.openxmlformats.org/officeDocument/2006/math" xmlns:v="urn:schemas-microsoft-com:vml" xmlns:wp14="http://schemas.microsoft.com/office/word/2010/wordprocessingDrawing" xmlns:wp="http://schemas.openxmlformats.org/drawingml/2006/wordprocessingDrawing" xmlns:w10="urn:schemas-microsoft-com:office:word" xmlns:w="http://schemas.openxmlformats.org/wordprocessingml/2006/main" xmlns:w14="http://schemas.microsoft.com/office/word/2010/wordml" xmlns:w15="http://schemas.microsoft.com/office/word/2012/wordml" xmlns:w16cex="http://schemas.microsoft.com/office/word/2018/wordml/cex" xmlns:w16cid="http://schemas.microsoft.com/office/word/2016/wordml/cid" xmlns:w16="http://schemas.microsoft.com/office/word/2018/wordml" xmlns:w16sdtdh="http://schemas.microsoft.com/office/word/2020/wordml/sdtdatahash" xmlns:w16se="http://schemas.microsoft.com/office/word/2015/wordml/symex" xmlns:wpg="http://schemas.microsoft.com/office/word/2010/wordprocessingGroup" xmlns:wpi="http://schemas.microsoft.com/office/word/2010/wordprocessingInk" xmlns:wne="http://schemas.microsoft.com/office/word/2006/wordml" xmlns:wps="http://schemas.microsoft.com/office/word/2010/wordprocessingShape" mc:Ignorable="w14 w15 w16se w16cid w16 w16cex w16sdtdh wp14">
+<w:document xmlns:wpc="http://schemas.microsoft.com/office/word/2010/wordprocessingCanvas" xmlns:cx="http://schemas.microsoft.com/office/drawing/2014/chartex" xmlns:cx1="http://schemas.microsoft.com/office/drawing/2015/9/8/chartex" xmlns:cx2="http://schemas.microsoft.com/office/drawing/2015/10/21/chartex" xmlns:cx3="http://schemas.microsoft.com/office/drawing/2016/5/9/chartex" xmlns:cx4="http://schemas.microsoft.com/office/drawing/2016/5/10/chartex" xmlns:cx5="http://schemas.microsoft.com/office/drawing/2016/5/11/chartex" xmlns:cx6="http://schemas.microsoft.com/office/drawing/2016/5/12/chartex" xmlns:cx7="http://schemas.microsoft.com/office/drawing/2016/5/13/chartex" xmlns:cx8="http://schemas.microsoft.com/office/drawing/2016/5/14/chartex" xmlns:mc="http://schemas.openxmlformats.org/markup-compatibility/2006" xmlns:aink="http://schemas.microsoft.com/office/drawing/2016/ink" xmlns:am3d="http://schemas.microsoft.com/office/drawing/2017/model3d" xmlns:o="urn:schemas-microsoft-com:office:office" xmlns:oel="http://schemas.microsoft.com/office/2019/extlst" xmlns:r="http://schemas.openxmlformats.org/officeDocument/2006/relationships" xmlns:m="http://schemas.openxmlformats.org/officeDocument/2006/math" xmlns:v="urn:schemas-microsoft-com:vml" xmlns:wp14="http://schemas.microsoft.com/office/word/2010/wordprocessingDrawing" xmlns:wp="http://schemas.openxmlformats.org/drawingml/2006/wordprocessingDrawing" xmlns:w10="urn:schemas-microsoft-com:office:word" xmlns:w="http://schemas.openxmlformats.org/wordprocessingml/2006/main" xmlns:w14="http://schemas.microsoft.com/office/word/2010/wordml" xmlns:w15="http://schemas.microsoft.com/office/word/2012/wordml" xmlns:w16cex="http://schemas.microsoft.com/office/word/2018/wordml/cex" xmlns:w16cid="http://schemas.microsoft.com/office/word/2016/wordml/cid" xmlns:w16="http://schemas.microsoft.com/office/word/2018/wordml" xmlns:w16du="http://schemas.microsoft.com/office/word/2023/wordml/word16du" xmlns:w16sdtdh="http://schemas.microsoft.com/office/word/2020/wordml/sdtdatahash" xmlns:w16sdtfl="http://schemas.microsoft.com/office/word/2024/wordml/sdtformatlock" xmlns:w16se="http://schemas.microsoft.com/office/word/2015/wordml/symex" xmlns:wpg="http://schemas.microsoft.com/office/word/2010/wordprocessingGroup" xmlns:wpi="http://schemas.microsoft.com/office/word/2010/wordprocessingInk" xmlns:wne="http://schemas.microsoft.com/office/word/2006/wordml" xmlns:wps="http://schemas.microsoft.com/office/word/2010/wordprocessingShape" mc:Ignorable="w14 w15 w16se w16cid w16 w16cex w16sdtdh w16sdtfl w16du wp14">
   <w:body>
     <w:p>
       <w:pPr>
@@ -82,7 +82,27 @@
           <w:sz w:val="28"/>
           <w:szCs w:val="28"/>
         </w:rPr>
-        <w:t>When you run a playbook, the first task usually says Gathering Facts. This is actually a call to the setup module.</w:t>
+        <w:t xml:space="preserve">When you run a playbook, the first task usually says Gathering Facts. This is actually a call to the </w:t>
+      </w:r>
+      <w:r>
+        <w:rPr>
+          <w:rFonts w:asciiTheme="majorBidi" w:hAnsiTheme="majorBidi" w:cstheme="majorBidi"/>
+          <w:b/>
+          <w:bCs/>
+          <w:i/>
+          <w:iCs/>
+          <w:sz w:val="28"/>
+          <w:szCs w:val="28"/>
+        </w:rPr>
+        <w:t>setup</w:t>
+      </w:r>
+      <w:r>
+        <w:rPr>
+          <w:rFonts w:asciiTheme="majorBidi" w:hAnsiTheme="majorBidi" w:cstheme="majorBidi"/>
+          <w:sz w:val="28"/>
+          <w:szCs w:val="28"/>
+        </w:rPr>
+        <w:t xml:space="preserve"> module.</w:t>
       </w:r>
     </w:p>
     <w:p>
@@ -1658,7 +1678,7 @@
     </w:p>
     <w:p>
       <w:pPr>
-        <w:spacing w:after="100"/>
+        <w:spacing w:after="120"/>
         <w:jc w:val="both"/>
         <w:rPr>
           <w:rFonts w:asciiTheme="majorBidi" w:hAnsiTheme="majorBidi" w:cstheme="majorBidi"/>
@@ -1736,58 +1756,326 @@
         <w:t>ansible_local</w:t>
       </w:r>
       <w:proofErr w:type="spellEnd"/>
-      <w:r>
-        <w:rPr>
-          <w:rFonts w:asciiTheme="majorBidi" w:hAnsiTheme="majorBidi" w:cstheme="majorBidi"/>
-          <w:b/>
-          <w:bCs/>
-          <w:i/>
-          <w:iCs/>
-          <w:sz w:val="28"/>
-          <w:szCs w:val="28"/>
-        </w:rPr>
-        <w:t>']['preferences']['app']['theme'] }}</w:t>
+      <w:proofErr w:type="gramStart"/>
+      <w:r>
+        <w:rPr>
+          <w:rFonts w:asciiTheme="majorBidi" w:hAnsiTheme="majorBidi" w:cstheme="majorBidi"/>
+          <w:b/>
+          <w:bCs/>
+          <w:i/>
+          <w:iCs/>
+          <w:sz w:val="28"/>
+          <w:szCs w:val="28"/>
+        </w:rPr>
+        <w:t>'][</w:t>
+      </w:r>
+      <w:proofErr w:type="gramEnd"/>
+      <w:r>
+        <w:rPr>
+          <w:rFonts w:asciiTheme="majorBidi" w:hAnsiTheme="majorBidi" w:cstheme="majorBidi"/>
+          <w:b/>
+          <w:bCs/>
+          <w:i/>
+          <w:iCs/>
+          <w:sz w:val="28"/>
+          <w:szCs w:val="28"/>
+        </w:rPr>
+        <w:t>'preferences</w:t>
+      </w:r>
+      <w:proofErr w:type="gramStart"/>
+      <w:r>
+        <w:rPr>
+          <w:rFonts w:asciiTheme="majorBidi" w:hAnsiTheme="majorBidi" w:cstheme="majorBidi"/>
+          <w:b/>
+          <w:bCs/>
+          <w:i/>
+          <w:iCs/>
+          <w:sz w:val="28"/>
+          <w:szCs w:val="28"/>
+        </w:rPr>
+        <w:t>'][</w:t>
+      </w:r>
+      <w:proofErr w:type="gramEnd"/>
+      <w:r>
+        <w:rPr>
+          <w:rFonts w:asciiTheme="majorBidi" w:hAnsiTheme="majorBidi" w:cstheme="majorBidi"/>
+          <w:b/>
+          <w:bCs/>
+          <w:i/>
+          <w:iCs/>
+          <w:sz w:val="28"/>
+          <w:szCs w:val="28"/>
+        </w:rPr>
+        <w:t>'app</w:t>
+      </w:r>
+      <w:proofErr w:type="gramStart"/>
+      <w:r>
+        <w:rPr>
+          <w:rFonts w:asciiTheme="majorBidi" w:hAnsiTheme="majorBidi" w:cstheme="majorBidi"/>
+          <w:b/>
+          <w:bCs/>
+          <w:i/>
+          <w:iCs/>
+          <w:sz w:val="28"/>
+          <w:szCs w:val="28"/>
+        </w:rPr>
+        <w:t>'][</w:t>
+      </w:r>
+      <w:proofErr w:type="gramEnd"/>
+      <w:r>
+        <w:rPr>
+          <w:rFonts w:asciiTheme="majorBidi" w:hAnsiTheme="majorBidi" w:cstheme="majorBidi"/>
+          <w:b/>
+          <w:bCs/>
+          <w:i/>
+          <w:iCs/>
+          <w:sz w:val="28"/>
+          <w:szCs w:val="28"/>
+        </w:rPr>
+        <w:t>'theme'</w:t>
+      </w:r>
+      <w:proofErr w:type="gramStart"/>
+      <w:r>
+        <w:rPr>
+          <w:rFonts w:asciiTheme="majorBidi" w:hAnsiTheme="majorBidi" w:cstheme="majorBidi"/>
+          <w:b/>
+          <w:bCs/>
+          <w:i/>
+          <w:iCs/>
+          <w:sz w:val="28"/>
+          <w:szCs w:val="28"/>
+        </w:rPr>
+        <w:t>] }</w:t>
+      </w:r>
+      <w:proofErr w:type="gramEnd"/>
+      <w:r>
+        <w:rPr>
+          <w:rFonts w:asciiTheme="majorBidi" w:hAnsiTheme="majorBidi" w:cstheme="majorBidi"/>
+          <w:b/>
+          <w:bCs/>
+          <w:i/>
+          <w:iCs/>
+          <w:sz w:val="28"/>
+          <w:szCs w:val="28"/>
+        </w:rPr>
+        <w:t>}</w:t>
       </w:r>
     </w:p>
     <w:p>
       <w:pPr>
+        <w:spacing w:after="40"/>
+        <w:jc w:val="both"/>
+        <w:rPr>
+          <w:rFonts w:asciiTheme="majorBidi" w:hAnsiTheme="majorBidi" w:cstheme="majorBidi"/>
+          <w:b/>
+          <w:bCs/>
+          <w:sz w:val="30"/>
+          <w:szCs w:val="30"/>
+        </w:rPr>
+      </w:pPr>
+      <w:r>
+        <w:rPr>
+          <w:rFonts w:asciiTheme="majorBidi" w:hAnsiTheme="majorBidi" w:cstheme="majorBidi"/>
+          <w:b/>
+          <w:bCs/>
+          <w:sz w:val="30"/>
+          <w:szCs w:val="30"/>
+        </w:rPr>
+        <w:t>The Mechanics: How the “Agentless” Agent works</w:t>
+      </w:r>
+    </w:p>
+    <w:p>
+      <w:pPr>
+        <w:jc w:val="both"/>
+        <w:rPr>
+          <w:rFonts w:asciiTheme="majorBidi" w:hAnsiTheme="majorBidi" w:cstheme="majorBidi"/>
+          <w:sz w:val="28"/>
+          <w:szCs w:val="28"/>
+        </w:rPr>
+      </w:pPr>
+      <w:r>
+        <w:rPr>
+          <w:rFonts w:asciiTheme="majorBidi" w:hAnsiTheme="majorBidi" w:cstheme="majorBidi"/>
+          <w:sz w:val="28"/>
+          <w:szCs w:val="28"/>
+        </w:rPr>
+        <w:t xml:space="preserve">Ansible is agentless, </w:t>
+      </w:r>
+      <w:proofErr w:type="gramStart"/>
+      <w:r>
+        <w:rPr>
+          <w:rFonts w:asciiTheme="majorBidi" w:hAnsiTheme="majorBidi" w:cstheme="majorBidi"/>
+          <w:sz w:val="28"/>
+          <w:szCs w:val="28"/>
+        </w:rPr>
+        <w:t>So</w:t>
+      </w:r>
+      <w:proofErr w:type="gramEnd"/>
+      <w:r>
+        <w:rPr>
+          <w:rFonts w:asciiTheme="majorBidi" w:hAnsiTheme="majorBidi" w:cstheme="majorBidi"/>
+          <w:sz w:val="28"/>
+          <w:szCs w:val="28"/>
+        </w:rPr>
+        <w:t xml:space="preserve"> how can a file in </w:t>
+      </w:r>
+      <w:r>
+        <w:rPr>
+          <w:rFonts w:asciiTheme="majorBidi" w:hAnsiTheme="majorBidi" w:cstheme="majorBidi"/>
+          <w:b/>
+          <w:bCs/>
+          <w:i/>
+          <w:iCs/>
+          <w:sz w:val="28"/>
+          <w:szCs w:val="28"/>
+        </w:rPr>
+        <w:t>/</w:t>
+      </w:r>
+      <w:proofErr w:type="spellStart"/>
+      <w:r>
+        <w:rPr>
+          <w:rFonts w:asciiTheme="majorBidi" w:hAnsiTheme="majorBidi" w:cstheme="majorBidi"/>
+          <w:b/>
+          <w:bCs/>
+          <w:i/>
+          <w:iCs/>
+          <w:sz w:val="28"/>
+          <w:szCs w:val="28"/>
+        </w:rPr>
+        <w:t>etc</w:t>
+      </w:r>
+      <w:proofErr w:type="spellEnd"/>
+      <w:r>
+        <w:rPr>
+          <w:rFonts w:asciiTheme="majorBidi" w:hAnsiTheme="majorBidi" w:cstheme="majorBidi"/>
+          <w:b/>
+          <w:bCs/>
+          <w:i/>
+          <w:iCs/>
+          <w:sz w:val="28"/>
+          <w:szCs w:val="28"/>
+        </w:rPr>
+        <w:t>/ansible/</w:t>
+      </w:r>
+      <w:proofErr w:type="spellStart"/>
+      <w:proofErr w:type="gramStart"/>
+      <w:r>
+        <w:rPr>
+          <w:rFonts w:asciiTheme="majorBidi" w:hAnsiTheme="majorBidi" w:cstheme="majorBidi"/>
+          <w:b/>
+          <w:bCs/>
+          <w:i/>
+          <w:iCs/>
+          <w:sz w:val="28"/>
+          <w:szCs w:val="28"/>
+        </w:rPr>
+        <w:t>facts.d</w:t>
+      </w:r>
+      <w:proofErr w:type="spellEnd"/>
+      <w:proofErr w:type="gramEnd"/>
+      <w:r>
+        <w:rPr>
+          <w:rFonts w:asciiTheme="majorBidi" w:hAnsiTheme="majorBidi" w:cstheme="majorBidi"/>
+          <w:b/>
+          <w:bCs/>
+          <w:i/>
+          <w:iCs/>
+          <w:sz w:val="28"/>
+          <w:szCs w:val="28"/>
+        </w:rPr>
+        <w:t>/</w:t>
+      </w:r>
+      <w:r>
+        <w:rPr>
+          <w:rFonts w:asciiTheme="majorBidi" w:hAnsiTheme="majorBidi" w:cstheme="majorBidi"/>
+          <w:sz w:val="28"/>
+          <w:szCs w:val="28"/>
+        </w:rPr>
+        <w:t xml:space="preserve"> possibly influence the control node?</w:t>
+      </w:r>
+    </w:p>
+    <w:p>
+      <w:pPr>
         <w:spacing w:after="60"/>
         <w:jc w:val="both"/>
         <w:rPr>
           <w:rFonts w:asciiTheme="majorBidi" w:hAnsiTheme="majorBidi" w:cstheme="majorBidi"/>
-          <w:b/>
-          <w:bCs/>
-          <w:sz w:val="30"/>
-          <w:szCs w:val="30"/>
-        </w:rPr>
-      </w:pPr>
-      <w:r>
-        <w:rPr>
-          <w:rFonts w:asciiTheme="majorBidi" w:hAnsiTheme="majorBidi" w:cstheme="majorBidi"/>
-          <w:b/>
-          <w:bCs/>
-          <w:sz w:val="30"/>
-          <w:szCs w:val="30"/>
-        </w:rPr>
-        <w:t>The Mechanics: How the “Agentless” Agent works</w:t>
-      </w:r>
-    </w:p>
-    <w:p>
-      <w:pPr>
-        <w:jc w:val="both"/>
-        <w:rPr>
-          <w:rFonts w:asciiTheme="majorBidi" w:hAnsiTheme="majorBidi" w:cstheme="majorBidi"/>
-          <w:sz w:val="28"/>
-          <w:szCs w:val="28"/>
-        </w:rPr>
-      </w:pPr>
-      <w:r>
-        <w:rPr>
-          <w:rFonts w:asciiTheme="majorBidi" w:hAnsiTheme="majorBidi" w:cstheme="majorBidi"/>
-          <w:sz w:val="28"/>
-          <w:szCs w:val="28"/>
-        </w:rPr>
-        <w:t xml:space="preserve">Ansible is agentless, So how can a file in </w:t>
+          <w:sz w:val="28"/>
+          <w:szCs w:val="28"/>
+        </w:rPr>
+      </w:pPr>
+      <w:r>
+        <w:rPr>
+          <w:rFonts w:asciiTheme="majorBidi" w:hAnsiTheme="majorBidi" w:cstheme="majorBidi"/>
+          <w:b/>
+          <w:bCs/>
+          <w:sz w:val="28"/>
+          <w:szCs w:val="28"/>
+        </w:rPr>
+        <w:lastRenderedPageBreak/>
+        <w:t>The setup Module’s Secret Task:</w:t>
+      </w:r>
+      <w:r>
+        <w:rPr>
+          <w:rFonts w:asciiTheme="majorBidi" w:hAnsiTheme="majorBidi" w:cstheme="majorBidi"/>
+          <w:sz w:val="28"/>
+          <w:szCs w:val="28"/>
+        </w:rPr>
+        <w:t xml:space="preserve"> When you run </w:t>
+      </w:r>
+      <w:proofErr w:type="spellStart"/>
+      <w:r>
+        <w:rPr>
+          <w:rFonts w:asciiTheme="majorBidi" w:hAnsiTheme="majorBidi" w:cstheme="majorBidi"/>
+          <w:b/>
+          <w:bCs/>
+          <w:i/>
+          <w:iCs/>
+          <w:sz w:val="28"/>
+          <w:szCs w:val="28"/>
+        </w:rPr>
+        <w:t>gather_facts</w:t>
+      </w:r>
+      <w:proofErr w:type="spellEnd"/>
+      <w:r>
+        <w:rPr>
+          <w:rFonts w:asciiTheme="majorBidi" w:hAnsiTheme="majorBidi" w:cstheme="majorBidi"/>
+          <w:b/>
+          <w:bCs/>
+          <w:i/>
+          <w:iCs/>
+          <w:sz w:val="28"/>
+          <w:szCs w:val="28"/>
+        </w:rPr>
+        <w:t>: yes</w:t>
+      </w:r>
+      <w:r>
+        <w:rPr>
+          <w:rFonts w:asciiTheme="majorBidi" w:hAnsiTheme="majorBidi" w:cstheme="majorBidi"/>
+          <w:sz w:val="28"/>
+          <w:szCs w:val="28"/>
+        </w:rPr>
+        <w:t xml:space="preserve">, the </w:t>
+      </w:r>
+      <w:r>
+        <w:rPr>
+          <w:rFonts w:asciiTheme="majorBidi" w:hAnsiTheme="majorBidi" w:cstheme="majorBidi"/>
+          <w:b/>
+          <w:bCs/>
+          <w:i/>
+          <w:iCs/>
+          <w:sz w:val="28"/>
+          <w:szCs w:val="28"/>
+        </w:rPr>
+        <w:t>setup</w:t>
+      </w:r>
+      <w:r>
+        <w:rPr>
+          <w:rFonts w:asciiTheme="majorBidi" w:hAnsiTheme="majorBidi" w:cstheme="majorBidi"/>
+          <w:sz w:val="28"/>
+          <w:szCs w:val="28"/>
+        </w:rPr>
+        <w:t xml:space="preserve"> module doesn’t just look at OS settings. It is programmed to check if the directory </w:t>
       </w:r>
       <w:r>
         <w:rPr>
@@ -1861,93 +2149,7 @@
           <w:sz w:val="28"/>
           <w:szCs w:val="28"/>
         </w:rPr>
-        <w:t xml:space="preserve"> possibly influence the control node?</w:t>
-      </w:r>
-    </w:p>
-    <w:p>
-      <w:pPr>
-        <w:spacing w:after="60"/>
-        <w:jc w:val="both"/>
-        <w:rPr>
-          <w:rFonts w:asciiTheme="majorBidi" w:hAnsiTheme="majorBidi" w:cstheme="majorBidi"/>
-          <w:sz w:val="28"/>
-          <w:szCs w:val="28"/>
-        </w:rPr>
-      </w:pPr>
-      <w:r>
-        <w:rPr>
-          <w:rFonts w:asciiTheme="majorBidi" w:hAnsiTheme="majorBidi" w:cstheme="majorBidi"/>
-          <w:b/>
-          <w:bCs/>
-          <w:sz w:val="28"/>
-          <w:szCs w:val="28"/>
-        </w:rPr>
-        <w:lastRenderedPageBreak/>
-        <w:t>The setup Module’s Secret Task:</w:t>
-      </w:r>
-      <w:r>
-        <w:rPr>
-          <w:rFonts w:asciiTheme="majorBidi" w:hAnsiTheme="majorBidi" w:cstheme="majorBidi"/>
-          <w:sz w:val="28"/>
-          <w:szCs w:val="28"/>
-        </w:rPr>
-        <w:t xml:space="preserve"> When you run </w:t>
-      </w:r>
-      <w:proofErr w:type="spellStart"/>
-      <w:r>
-        <w:rPr>
-          <w:rFonts w:asciiTheme="majorBidi" w:hAnsiTheme="majorBidi" w:cstheme="majorBidi"/>
-          <w:sz w:val="28"/>
-          <w:szCs w:val="28"/>
-        </w:rPr>
-        <w:t>gather_facts</w:t>
-      </w:r>
-      <w:proofErr w:type="spellEnd"/>
-      <w:r>
-        <w:rPr>
-          <w:rFonts w:asciiTheme="majorBidi" w:hAnsiTheme="majorBidi" w:cstheme="majorBidi"/>
-          <w:sz w:val="28"/>
-          <w:szCs w:val="28"/>
-        </w:rPr>
-        <w:t>: yes, the setup module doesn’t just look at OS settings. It is programmed to check if the directory /</w:t>
-      </w:r>
-      <w:proofErr w:type="spellStart"/>
-      <w:r>
-        <w:rPr>
-          <w:rFonts w:asciiTheme="majorBidi" w:hAnsiTheme="majorBidi" w:cstheme="majorBidi"/>
-          <w:sz w:val="28"/>
-          <w:szCs w:val="28"/>
-        </w:rPr>
-        <w:t>etc</w:t>
-      </w:r>
-      <w:proofErr w:type="spellEnd"/>
-      <w:r>
-        <w:rPr>
-          <w:rFonts w:asciiTheme="majorBidi" w:hAnsiTheme="majorBidi" w:cstheme="majorBidi"/>
-          <w:sz w:val="28"/>
-          <w:szCs w:val="28"/>
-        </w:rPr>
-        <w:t>/ansible/</w:t>
-      </w:r>
-      <w:proofErr w:type="spellStart"/>
-      <w:proofErr w:type="gramStart"/>
-      <w:r>
-        <w:rPr>
-          <w:rFonts w:asciiTheme="majorBidi" w:hAnsiTheme="majorBidi" w:cstheme="majorBidi"/>
-          <w:sz w:val="28"/>
-          <w:szCs w:val="28"/>
-        </w:rPr>
-        <w:t>facts.d</w:t>
-      </w:r>
-      <w:proofErr w:type="spellEnd"/>
-      <w:proofErr w:type="gramEnd"/>
-      <w:r>
-        <w:rPr>
-          <w:rFonts w:asciiTheme="majorBidi" w:hAnsiTheme="majorBidi" w:cstheme="majorBidi"/>
-          <w:sz w:val="28"/>
-          <w:szCs w:val="28"/>
-        </w:rPr>
-        <w:t>/ exists on the remote host.</w:t>
+        <w:t xml:space="preserve"> exists on the remote host.</w:t>
       </w:r>
     </w:p>
     <w:p>
@@ -2023,12 +2225,28 @@
           <w:sz w:val="28"/>
           <w:szCs w:val="28"/>
         </w:rPr>
-        <w:t>If it finds an .</w:t>
+        <w:t xml:space="preserve">If it finds an </w:t>
+      </w:r>
+      <w:r>
+        <w:rPr>
+          <w:rFonts w:asciiTheme="majorBidi" w:hAnsiTheme="majorBidi" w:cstheme="majorBidi"/>
+          <w:b/>
+          <w:bCs/>
+          <w:i/>
+          <w:iCs/>
+          <w:sz w:val="28"/>
+          <w:szCs w:val="28"/>
+        </w:rPr>
+        <w:t>.</w:t>
       </w:r>
       <w:proofErr w:type="spellStart"/>
       <w:r>
         <w:rPr>
           <w:rFonts w:asciiTheme="majorBidi" w:hAnsiTheme="majorBidi" w:cstheme="majorBidi"/>
+          <w:b/>
+          <w:bCs/>
+          <w:i/>
+          <w:iCs/>
           <w:sz w:val="28"/>
           <w:szCs w:val="28"/>
         </w:rPr>
@@ -2041,12 +2259,28 @@
           <w:sz w:val="28"/>
           <w:szCs w:val="28"/>
         </w:rPr>
-        <w:t xml:space="preserve"> or .</w:t>
+        <w:t xml:space="preserve"> or </w:t>
+      </w:r>
+      <w:r>
+        <w:rPr>
+          <w:rFonts w:asciiTheme="majorBidi" w:hAnsiTheme="majorBidi" w:cstheme="majorBidi"/>
+          <w:b/>
+          <w:bCs/>
+          <w:i/>
+          <w:iCs/>
+          <w:sz w:val="28"/>
+          <w:szCs w:val="28"/>
+        </w:rPr>
+        <w:t>.</w:t>
       </w:r>
       <w:proofErr w:type="spellStart"/>
       <w:r>
         <w:rPr>
           <w:rFonts w:asciiTheme="majorBidi" w:hAnsiTheme="majorBidi" w:cstheme="majorBidi"/>
+          <w:b/>
+          <w:bCs/>
+          <w:i/>
+          <w:iCs/>
           <w:sz w:val="28"/>
           <w:szCs w:val="28"/>
         </w:rPr>
@@ -2223,6 +2457,7 @@
     </w:p>
     <w:p>
       <w:pPr>
+        <w:spacing w:after="80"/>
         <w:jc w:val="both"/>
         <w:rPr>
           <w:rFonts w:asciiTheme="majorBidi" w:hAnsiTheme="majorBidi" w:cstheme="majorBidi"/>
@@ -2385,6 +2620,7 @@
                                 <w:bCs/>
                                 <w:i/>
                                 <w:iCs/>
+                                <w:color w:val="808080" w:themeColor="background1" w:themeShade="80"/>
                                 <w:sz w:val="28"/>
                                 <w:szCs w:val="28"/>
                               </w:rPr>
@@ -2396,6 +2632,7 @@
                                 <w:bCs/>
                                 <w:i/>
                                 <w:iCs/>
+                                <w:color w:val="808080" w:themeColor="background1" w:themeShade="80"/>
                                 <w:sz w:val="28"/>
                                 <w:szCs w:val="28"/>
                               </w:rPr>
@@ -2566,6 +2803,7 @@
                           <w:bCs/>
                           <w:i/>
                           <w:iCs/>
+                          <w:color w:val="808080" w:themeColor="background1" w:themeShade="80"/>
                           <w:sz w:val="28"/>
                           <w:szCs w:val="28"/>
                         </w:rPr>
@@ -2577,6 +2815,7 @@
                           <w:bCs/>
                           <w:i/>
                           <w:iCs/>
+                          <w:color w:val="808080" w:themeColor="background1" w:themeShade="80"/>
                           <w:sz w:val="28"/>
                           <w:szCs w:val="28"/>
                         </w:rPr>
@@ -3195,7 +3434,46 @@
                                 <w:sz w:val="26"/>
                                 <w:szCs w:val="26"/>
                               </w:rPr>
-                              <w:t>_status.backup_last_run</w:t>
+                              <w:t>_</w:t>
+                            </w:r>
+                            <w:proofErr w:type="gramStart"/>
+                            <w:r>
+                              <w:rPr>
+                                <w:rFonts w:asciiTheme="majorBidi" w:hAnsiTheme="majorBidi" w:cstheme="majorBidi"/>
+                                <w:b/>
+                                <w:bCs/>
+                                <w:i/>
+                                <w:iCs/>
+                                <w:sz w:val="26"/>
+                                <w:szCs w:val="26"/>
+                              </w:rPr>
+                              <w:t>status.backup</w:t>
+                            </w:r>
+                            <w:proofErr w:type="gramEnd"/>
+                            <w:r>
+                              <w:rPr>
+                                <w:rFonts w:asciiTheme="majorBidi" w:hAnsiTheme="majorBidi" w:cstheme="majorBidi"/>
+                                <w:b/>
+                                <w:bCs/>
+                                <w:i/>
+                                <w:iCs/>
+                                <w:sz w:val="26"/>
+                                <w:szCs w:val="26"/>
+                              </w:rPr>
+                              <w:t>_last_</w:t>
+                            </w:r>
+                            <w:proofErr w:type="gramStart"/>
+                            <w:r>
+                              <w:rPr>
+                                <w:rFonts w:asciiTheme="majorBidi" w:hAnsiTheme="majorBidi" w:cstheme="majorBidi"/>
+                                <w:b/>
+                                <w:bCs/>
+                                <w:i/>
+                                <w:iCs/>
+                                <w:sz w:val="26"/>
+                                <w:szCs w:val="26"/>
+                              </w:rPr>
+                              <w:t>run</w:t>
                             </w:r>
                             <w:proofErr w:type="spellEnd"/>
                             <w:r>
@@ -3210,6 +3488,7 @@
                               </w:rPr>
                               <w:t xml:space="preserve"> }}"</w:t>
                             </w:r>
+                            <w:proofErr w:type="gramEnd"/>
                           </w:p>
                           <w:p>
                             <w:pPr>
@@ -5211,7 +5490,27 @@
           <w:sz w:val="28"/>
           <w:szCs w:val="28"/>
         </w:rPr>
-        <w:t xml:space="preserve">Facts gatherable by setup have lower precedence than your manually defined vars or </w:t>
+        <w:t xml:space="preserve">Facts gatherable by </w:t>
+      </w:r>
+      <w:r>
+        <w:rPr>
+          <w:rFonts w:asciiTheme="majorBidi" w:hAnsiTheme="majorBidi" w:cstheme="majorBidi"/>
+          <w:b/>
+          <w:bCs/>
+          <w:i/>
+          <w:iCs/>
+          <w:sz w:val="28"/>
+          <w:szCs w:val="28"/>
+        </w:rPr>
+        <w:t>setup</w:t>
+      </w:r>
+      <w:r>
+        <w:rPr>
+          <w:rFonts w:asciiTheme="majorBidi" w:hAnsiTheme="majorBidi" w:cstheme="majorBidi"/>
+          <w:sz w:val="28"/>
+          <w:szCs w:val="28"/>
+        </w:rPr>
+        <w:t xml:space="preserve"> have lower precedence than your manually defined vars or </w:t>
       </w:r>
       <w:proofErr w:type="spellStart"/>
       <w:r>
@@ -5797,9 +6096,23 @@
           <w:sz w:val="28"/>
           <w:szCs w:val="28"/>
         </w:rPr>
-        <w:t>_facts.distribution</w:t>
+        <w:t>_</w:t>
+      </w:r>
+      <w:proofErr w:type="gramStart"/>
+      <w:r>
+        <w:rPr>
+          <w:rFonts w:asciiTheme="majorBidi" w:hAnsiTheme="majorBidi" w:cstheme="majorBidi"/>
+          <w:b/>
+          <w:bCs/>
+          <w:i/>
+          <w:iCs/>
+          <w:sz w:val="28"/>
+          <w:szCs w:val="28"/>
+        </w:rPr>
+        <w:t>facts.distribution</w:t>
       </w:r>
       <w:proofErr w:type="spellEnd"/>
+      <w:proofErr w:type="gramEnd"/>
       <w:r>
         <w:rPr>
           <w:rFonts w:asciiTheme="majorBidi" w:hAnsiTheme="majorBidi" w:cstheme="majorBidi"/>
@@ -5833,17 +6146,7 @@
           <w:sz w:val="32"/>
           <w:szCs w:val="32"/>
         </w:rPr>
-        <w:t>Summary</w:t>
-      </w:r>
-      <w:r>
-        <w:rPr>
-          <w:rFonts w:asciiTheme="majorBidi" w:hAnsiTheme="majorBidi" w:cstheme="majorBidi"/>
-          <w:b/>
-          <w:bCs/>
-          <w:sz w:val="32"/>
-          <w:szCs w:val="32"/>
-        </w:rPr>
-        <w:t>:</w:t>
+        <w:t>Summary:</w:t>
       </w:r>
     </w:p>
     <w:p>
@@ -5877,15 +6180,7 @@
           <w:sz w:val="28"/>
           <w:szCs w:val="28"/>
         </w:rPr>
-        <w:t xml:space="preserve"> </w:t>
-      </w:r>
-      <w:r>
-        <w:rPr>
-          <w:rFonts w:asciiTheme="majorBidi" w:hAnsiTheme="majorBidi" w:cstheme="majorBidi"/>
-          <w:sz w:val="28"/>
-          <w:szCs w:val="28"/>
-        </w:rPr>
-        <w:t>→ The engine that discovers reality.</w:t>
+        <w:t xml:space="preserve"> → The engine that discovers reality.</w:t>
       </w:r>
     </w:p>
     <w:p>
@@ -5923,15 +6218,7 @@
           <w:sz w:val="28"/>
           <w:szCs w:val="28"/>
         </w:rPr>
-        <w:t xml:space="preserve"> </w:t>
-      </w:r>
-      <w:r>
-        <w:rPr>
-          <w:rFonts w:asciiTheme="majorBidi" w:hAnsiTheme="majorBidi" w:cstheme="majorBidi"/>
-          <w:sz w:val="28"/>
-          <w:szCs w:val="28"/>
-        </w:rPr>
-        <w:t>→ The structured dictionary where all reality is stored.</w:t>
+        <w:t xml:space="preserve"> → The structured dictionary where all reality is stored.</w:t>
       </w:r>
     </w:p>
     <w:p>
@@ -5965,15 +6252,7 @@
           <w:sz w:val="28"/>
           <w:szCs w:val="28"/>
         </w:rPr>
-        <w:t xml:space="preserve"> </w:t>
-      </w:r>
-      <w:r>
-        <w:rPr>
-          <w:rFonts w:asciiTheme="majorBidi" w:hAnsiTheme="majorBidi" w:cstheme="majorBidi"/>
-          <w:sz w:val="28"/>
-          <w:szCs w:val="28"/>
-        </w:rPr>
-        <w:t xml:space="preserve">→ </w:t>
+        <w:t xml:space="preserve"> → </w:t>
       </w:r>
       <w:r>
         <w:rPr>
@@ -6039,35 +6318,15 @@
           <w:sz w:val="28"/>
           <w:szCs w:val="28"/>
         </w:rPr>
-        <w:t>/</w:t>
-      </w:r>
-      <w:r>
-        <w:rPr>
-          <w:rFonts w:asciiTheme="majorBidi" w:hAnsiTheme="majorBidi" w:cstheme="majorBidi"/>
-          <w:b/>
-          <w:bCs/>
-          <w:i/>
-          <w:iCs/>
-          <w:sz w:val="28"/>
-          <w:szCs w:val="28"/>
-        </w:rPr>
-        <w:t xml:space="preserve"> </w:t>
-      </w:r>
-      <w:r>
-        <w:rPr>
-          <w:rFonts w:asciiTheme="majorBidi" w:hAnsiTheme="majorBidi" w:cstheme="majorBidi"/>
-          <w:sz w:val="28"/>
-          <w:szCs w:val="28"/>
-        </w:rPr>
-        <w:t xml:space="preserve">- </w:t>
-      </w:r>
-      <w:r>
-        <w:rPr>
-          <w:rFonts w:asciiTheme="majorBidi" w:hAnsiTheme="majorBidi" w:cstheme="majorBidi"/>
-          <w:sz w:val="28"/>
-          <w:szCs w:val="28"/>
-        </w:rPr>
-        <w:t>allowing hosts to report their own context.</w:t>
+        <w:t xml:space="preserve">/ </w:t>
+      </w:r>
+      <w:r>
+        <w:rPr>
+          <w:rFonts w:asciiTheme="majorBidi" w:hAnsiTheme="majorBidi" w:cstheme="majorBidi"/>
+          <w:sz w:val="28"/>
+          <w:szCs w:val="28"/>
+        </w:rPr>
+        <w:t>- allowing hosts to report their own context.</w:t>
       </w:r>
     </w:p>
     <w:p>
@@ -6101,15 +6360,7 @@
           <w:sz w:val="28"/>
           <w:szCs w:val="28"/>
         </w:rPr>
-        <w:t xml:space="preserve"> </w:t>
-      </w:r>
-      <w:r>
-        <w:rPr>
-          <w:rFonts w:asciiTheme="majorBidi" w:hAnsiTheme="majorBidi" w:cstheme="majorBidi"/>
-          <w:sz w:val="28"/>
-          <w:szCs w:val="28"/>
-        </w:rPr>
-        <w:t>→ Persistent storage (Redis/Files) to avoid redundant discovery.</w:t>
+        <w:t xml:space="preserve"> → Persistent storage (Redis/Files) to avoid redundant discovery.</w:t>
       </w:r>
     </w:p>
     <w:p>
@@ -6148,15 +6399,7 @@
           <w:sz w:val="28"/>
           <w:szCs w:val="28"/>
         </w:rPr>
-        <w:t xml:space="preserve"> </w:t>
-      </w:r>
-      <w:r>
-        <w:rPr>
-          <w:rFonts w:asciiTheme="majorBidi" w:hAnsiTheme="majorBidi" w:cstheme="majorBidi"/>
-          <w:sz w:val="28"/>
-          <w:szCs w:val="28"/>
-        </w:rPr>
-        <w:t>→ Optimization technique to restrict what Ansible probes.</w:t>
+        <w:t xml:space="preserve"> → Optimization technique to restrict what Ansible probes.</w:t>
       </w:r>
     </w:p>
     <w:p>
@@ -6411,6 +6654,8 @@
       <w:r>
         <w:rPr>
           <w:rFonts w:asciiTheme="majorBidi" w:hAnsiTheme="majorBidi" w:cstheme="majorBidi"/>
+          <w:b/>
+          <w:bCs/>
           <w:noProof/>
           <w:sz w:val="28"/>
           <w:szCs w:val="28"/>
@@ -6820,10 +7065,20 @@
       <w:r>
         <w:rPr>
           <w:rFonts w:asciiTheme="majorBidi" w:hAnsiTheme="majorBidi" w:cstheme="majorBidi"/>
-          <w:sz w:val="28"/>
-          <w:szCs w:val="28"/>
-        </w:rPr>
-        <w:t xml:space="preserve">The Pro-Move: If you use </w:t>
+          <w:b/>
+          <w:bCs/>
+          <w:sz w:val="28"/>
+          <w:szCs w:val="28"/>
+        </w:rPr>
+        <w:t>The Pro-Move:</w:t>
+      </w:r>
+      <w:r>
+        <w:rPr>
+          <w:rFonts w:asciiTheme="majorBidi" w:hAnsiTheme="majorBidi" w:cstheme="majorBidi"/>
+          <w:sz w:val="28"/>
+          <w:szCs w:val="28"/>
+        </w:rPr>
+        <w:t xml:space="preserve"> If you use </w:t>
       </w:r>
       <w:proofErr w:type="spellStart"/>
       <w:r>
@@ -7083,7 +7338,27 @@
           <w:sz w:val="28"/>
           <w:szCs w:val="28"/>
         </w:rPr>
-        <w:t xml:space="preserve"> → In older Ansible versions, facts were dumped into the global namespace. ansible_eth0 was a variable.</w:t>
+        <w:t xml:space="preserve"> → In older Ansible versions, facts were dumped into the global namespace. </w:t>
+      </w:r>
+      <w:r>
+        <w:rPr>
+          <w:rFonts w:asciiTheme="majorBidi" w:hAnsiTheme="majorBidi" w:cstheme="majorBidi"/>
+          <w:b/>
+          <w:bCs/>
+          <w:i/>
+          <w:iCs/>
+          <w:sz w:val="28"/>
+          <w:szCs w:val="28"/>
+        </w:rPr>
+        <w:t>ansible_eth0</w:t>
+      </w:r>
+      <w:r>
+        <w:rPr>
+          <w:rFonts w:asciiTheme="majorBidi" w:hAnsiTheme="majorBidi" w:cstheme="majorBidi"/>
+          <w:sz w:val="28"/>
+          <w:szCs w:val="28"/>
+        </w:rPr>
+        <w:t xml:space="preserve"> was a variable.</w:t>
       </w:r>
     </w:p>
     <w:p>
@@ -7377,6 +7652,7 @@
     </w:p>
     <w:p>
       <w:pPr>
+        <w:spacing w:after="80"/>
         <w:jc w:val="both"/>
         <w:rPr>
           <w:rFonts w:asciiTheme="majorBidi" w:hAnsiTheme="majorBidi" w:cstheme="majorBidi"/>
@@ -7509,19 +7785,7 @@
                                 <w:sz w:val="28"/>
                                 <w:szCs w:val="28"/>
                               </w:rPr>
-                              <w:t xml:space="preserve">   </w:t>
-                            </w:r>
-                            <w:r>
-                              <w:rPr>
-                                <w:rFonts w:asciiTheme="majorBidi" w:hAnsiTheme="majorBidi" w:cstheme="majorBidi"/>
-                                <w:b/>
-                                <w:bCs/>
-                                <w:i/>
-                                <w:iCs/>
-                                <w:sz w:val="28"/>
-                                <w:szCs w:val="28"/>
-                              </w:rPr>
-                              <w:t>setup:</w:t>
+                              <w:t xml:space="preserve">   setup:</w:t>
                             </w:r>
                           </w:p>
                           <w:p>
@@ -7547,19 +7811,7 @@
                                 <w:sz w:val="28"/>
                                 <w:szCs w:val="28"/>
                               </w:rPr>
-                              <w:t xml:space="preserve">       </w:t>
-                            </w:r>
-                            <w:r>
-                              <w:rPr>
-                                <w:rFonts w:asciiTheme="majorBidi" w:hAnsiTheme="majorBidi" w:cstheme="majorBidi"/>
-                                <w:b/>
-                                <w:bCs/>
-                                <w:i/>
-                                <w:iCs/>
-                                <w:sz w:val="28"/>
-                                <w:szCs w:val="28"/>
-                              </w:rPr>
-                              <w:t>filter: "</w:t>
+                              <w:t xml:space="preserve">       filter: "</w:t>
                             </w:r>
                             <w:proofErr w:type="spellStart"/>
                             <w:r>
@@ -8471,7 +8723,7 @@
 </file>
 
 <file path=word/numbering.xml><?xml version="1.0" encoding="utf-8"?>
-<w:numbering xmlns:wpc="http://schemas.microsoft.com/office/word/2010/wordprocessingCanvas" xmlns:cx="http://schemas.microsoft.com/office/drawing/2014/chartex" xmlns:cx1="http://schemas.microsoft.com/office/drawing/2015/9/8/chartex" xmlns:cx2="http://schemas.microsoft.com/office/drawing/2015/10/21/chartex" xmlns:cx3="http://schemas.microsoft.com/office/drawing/2016/5/9/chartex" xmlns:cx4="http://schemas.microsoft.com/office/drawing/2016/5/10/chartex" xmlns:cx5="http://schemas.microsoft.com/office/drawing/2016/5/11/chartex" xmlns:cx6="http://schemas.microsoft.com/office/drawing/2016/5/12/chartex" xmlns:cx7="http://schemas.microsoft.com/office/drawing/2016/5/13/chartex" xmlns:cx8="http://schemas.microsoft.com/office/drawing/2016/5/14/chartex" xmlns:mc="http://schemas.openxmlformats.org/markup-compatibility/2006" xmlns:aink="http://schemas.microsoft.com/office/drawing/2016/ink" xmlns:am3d="http://schemas.microsoft.com/office/drawing/2017/model3d" xmlns:o="urn:schemas-microsoft-com:office:office" xmlns:oel="http://schemas.microsoft.com/office/2019/extlst" xmlns:r="http://schemas.openxmlformats.org/officeDocument/2006/relationships" xmlns:m="http://schemas.openxmlformats.org/officeDocument/2006/math" xmlns:v="urn:schemas-microsoft-com:vml" xmlns:wp14="http://schemas.microsoft.com/office/word/2010/wordprocessingDrawing" xmlns:wp="http://schemas.openxmlformats.org/drawingml/2006/wordprocessingDrawing" xmlns:w10="urn:schemas-microsoft-com:office:word" xmlns:w="http://schemas.openxmlformats.org/wordprocessingml/2006/main" xmlns:w14="http://schemas.microsoft.com/office/word/2010/wordml" xmlns:w15="http://schemas.microsoft.com/office/word/2012/wordml" xmlns:w16cex="http://schemas.microsoft.com/office/word/2018/wordml/cex" xmlns:w16cid="http://schemas.microsoft.com/office/word/2016/wordml/cid" xmlns:w16="http://schemas.microsoft.com/office/word/2018/wordml" xmlns:w16sdtdh="http://schemas.microsoft.com/office/word/2020/wordml/sdtdatahash" xmlns:w16se="http://schemas.microsoft.com/office/word/2015/wordml/symex" xmlns:wpg="http://schemas.microsoft.com/office/word/2010/wordprocessingGroup" xmlns:wpi="http://schemas.microsoft.com/office/word/2010/wordprocessingInk" xmlns:wne="http://schemas.microsoft.com/office/word/2006/wordml" xmlns:wps="http://schemas.microsoft.com/office/word/2010/wordprocessingShape" mc:Ignorable="w14 w15 w16se w16cid w16 w16cex w16sdtdh wp14">
+<w:numbering xmlns:wpc="http://schemas.microsoft.com/office/word/2010/wordprocessingCanvas" xmlns:cx="http://schemas.microsoft.com/office/drawing/2014/chartex" xmlns:cx1="http://schemas.microsoft.com/office/drawing/2015/9/8/chartex" xmlns:cx2="http://schemas.microsoft.com/office/drawing/2015/10/21/chartex" xmlns:cx3="http://schemas.microsoft.com/office/drawing/2016/5/9/chartex" xmlns:cx4="http://schemas.microsoft.com/office/drawing/2016/5/10/chartex" xmlns:cx5="http://schemas.microsoft.com/office/drawing/2016/5/11/chartex" xmlns:cx6="http://schemas.microsoft.com/office/drawing/2016/5/12/chartex" xmlns:cx7="http://schemas.microsoft.com/office/drawing/2016/5/13/chartex" xmlns:cx8="http://schemas.microsoft.com/office/drawing/2016/5/14/chartex" xmlns:mc="http://schemas.openxmlformats.org/markup-compatibility/2006" xmlns:aink="http://schemas.microsoft.com/office/drawing/2016/ink" xmlns:am3d="http://schemas.microsoft.com/office/drawing/2017/model3d" xmlns:o="urn:schemas-microsoft-com:office:office" xmlns:oel="http://schemas.microsoft.com/office/2019/extlst" xmlns:r="http://schemas.openxmlformats.org/officeDocument/2006/relationships" xmlns:m="http://schemas.openxmlformats.org/officeDocument/2006/math" xmlns:v="urn:schemas-microsoft-com:vml" xmlns:wp14="http://schemas.microsoft.com/office/word/2010/wordprocessingDrawing" xmlns:wp="http://schemas.openxmlformats.org/drawingml/2006/wordprocessingDrawing" xmlns:w10="urn:schemas-microsoft-com:office:word" xmlns:w="http://schemas.openxmlformats.org/wordprocessingml/2006/main" xmlns:w14="http://schemas.microsoft.com/office/word/2010/wordml" xmlns:w15="http://schemas.microsoft.com/office/word/2012/wordml" xmlns:w16cex="http://schemas.microsoft.com/office/word/2018/wordml/cex" xmlns:w16cid="http://schemas.microsoft.com/office/word/2016/wordml/cid" xmlns:w16="http://schemas.microsoft.com/office/word/2018/wordml" xmlns:w16du="http://schemas.microsoft.com/office/word/2023/wordml/word16du" xmlns:w16sdtdh="http://schemas.microsoft.com/office/word/2020/wordml/sdtdatahash" xmlns:w16sdtfl="http://schemas.microsoft.com/office/word/2024/wordml/sdtformatlock" xmlns:w16se="http://schemas.microsoft.com/office/word/2015/wordml/symex" xmlns:wpg="http://schemas.microsoft.com/office/word/2010/wordprocessingGroup" xmlns:wpi="http://schemas.microsoft.com/office/word/2010/wordprocessingInk" xmlns:wne="http://schemas.microsoft.com/office/word/2006/wordml" xmlns:wps="http://schemas.microsoft.com/office/word/2010/wordprocessingShape" mc:Ignorable="w14 w15 w16se w16cid w16 w16cex w16sdtdh w16sdtfl w16du wp14">
   <w:abstractNum w:abstractNumId="0" w15:restartNumberingAfterBreak="0">
     <w:nsid w:val="018E533B"/>
     <w:multiLevelType w:val="hybridMultilevel"/>
@@ -8913,7 +9165,7 @@
 </file>
 
 <file path=word/styles.xml><?xml version="1.0" encoding="utf-8"?>
-<w:styles xmlns:mc="http://schemas.openxmlformats.org/markup-compatibility/2006" xmlns:r="http://schemas.openxmlformats.org/officeDocument/2006/relationships" xmlns:w="http://schemas.openxmlformats.org/wordprocessingml/2006/main" xmlns:w14="http://schemas.microsoft.com/office/word/2010/wordml" xmlns:w15="http://schemas.microsoft.com/office/word/2012/wordml" xmlns:w16cex="http://schemas.microsoft.com/office/word/2018/wordml/cex" xmlns:w16cid="http://schemas.microsoft.com/office/word/2016/wordml/cid" xmlns:w16="http://schemas.microsoft.com/office/word/2018/wordml" xmlns:w16sdtdh="http://schemas.microsoft.com/office/word/2020/wordml/sdtdatahash" xmlns:w16se="http://schemas.microsoft.com/office/word/2015/wordml/symex" mc:Ignorable="w14 w15 w16se w16cid w16 w16cex w16sdtdh">
+<w:styles xmlns:mc="http://schemas.openxmlformats.org/markup-compatibility/2006" xmlns:r="http://schemas.openxmlformats.org/officeDocument/2006/relationships" xmlns:w="http://schemas.openxmlformats.org/wordprocessingml/2006/main" xmlns:w14="http://schemas.microsoft.com/office/word/2010/wordml" xmlns:w15="http://schemas.microsoft.com/office/word/2012/wordml" xmlns:w16cex="http://schemas.microsoft.com/office/word/2018/wordml/cex" xmlns:w16cid="http://schemas.microsoft.com/office/word/2016/wordml/cid" xmlns:w16="http://schemas.microsoft.com/office/word/2018/wordml" xmlns:w16du="http://schemas.microsoft.com/office/word/2023/wordml/word16du" xmlns:w16sdtdh="http://schemas.microsoft.com/office/word/2020/wordml/sdtdatahash" xmlns:w16sdtfl="http://schemas.microsoft.com/office/word/2024/wordml/sdtformatlock" xmlns:w16se="http://schemas.microsoft.com/office/word/2015/wordml/symex" mc:Ignorable="w14 w15 w16se w16cid w16 w16cex w16sdtdh w16sdtfl w16du">
   <w:docDefaults>
     <w:rPrDefault>
       <w:rPr>
@@ -10125,4 +10377,16 @@
     </a:ext>
   </a:extLst>
 </a:theme>
+</file>
+
+<file path=customXml/item1.xml><?xml version="1.0" encoding="utf-8"?>
+<b:Sources xmlns:b="http://schemas.openxmlformats.org/officeDocument/2006/bibliography" xmlns="http://schemas.openxmlformats.org/officeDocument/2006/bibliography" SelectedStyle="\APASixthEditionOfficeOnline.xsl" StyleName="APA" Version="6"/>
+</file>
+
+<file path=customXml/itemProps1.xml><?xml version="1.0" encoding="utf-8"?>
+<ds:datastoreItem xmlns:ds="http://schemas.openxmlformats.org/officeDocument/2006/customXml" ds:itemID="{B5CE86CD-EE86-4497-944A-4C73BB8A7DAE}">
+  <ds:schemaRefs>
+    <ds:schemaRef ds:uri="http://schemas.openxmlformats.org/officeDocument/2006/bibliography"/>
+  </ds:schemaRefs>
+</ds:datastoreItem>
 </file>
</xml_diff>